<commit_message>
feat: incident assignees/types/deadlines, simplify documents, logo in constructor
</commit_message>
<xml_diff>
--- a/backend/app/templates/position_certificate.docx
+++ b/backend/app/templates/position_certificate.docx
@@ -2,6 +2,14 @@
 <file path=word/document.xml><?xml version="1.0" encoding="utf-8"?>
 <w:document xmlns:wpc="http://schemas.microsoft.com/office/word/2010/wordprocessingCanvas" xmlns:mo="http://schemas.microsoft.com/office/mac/office/2008/main" xmlns:mc="http://schemas.openxmlformats.org/markup-compatibility/2006" xmlns:mv="urn:schemas-microsoft-com:mac:vml" xmlns:o="urn:schemas-microsoft-com:office:office" xmlns:r="http://schemas.openxmlformats.org/officeDocument/2006/relationships" xmlns:m="http://schemas.openxmlformats.org/officeDocument/2006/math" xmlns:v="urn:schemas-microsoft-com:vml" xmlns:wp14="http://schemas.microsoft.com/office/word/2010/wordprocessingDrawing" xmlns:wp="http://schemas.openxmlformats.org/drawingml/2006/wordprocessingDrawing" xmlns:w10="urn:schemas-microsoft-com:office:word" xmlns:w="http://schemas.openxmlformats.org/wordprocessingml/2006/main" xmlns:w14="http://schemas.microsoft.com/office/word/2010/wordml" xmlns:wpg="http://schemas.microsoft.com/office/word/2010/wordprocessingGroup" xmlns:wpi="http://schemas.microsoft.com/office/word/2010/wordprocessingInk" xmlns:wne="http://schemas.microsoft.com/office/word/2006/wordml" xmlns:wps="http://schemas.microsoft.com/office/word/2010/wordprocessingShape" mc:Ignorable="w14 wp14">
   <w:body>
+    <w:p>
+      <w:pPr>
+        <w:jc w:val="center"/>
+      </w:pPr>
+      <w:r>
+        <w:t>{{ logo }}</w:t>
+      </w:r>
+    </w:p>
     <w:p>
       <w:pPr>
         <w:pStyle w:val="Heading1"/>

</xml_diff>

<commit_message>
fix: responsive navbar, formal docx styling (Times New Roman, larger logo)
</commit_message>
<xml_diff>
--- a/backend/app/templates/position_certificate.docx
+++ b/backend/app/templates/position_certificate.docx
@@ -21,6 +21,9 @@
     </w:p>
     <w:p/>
     <w:p>
+      <w:pPr>
+        <w:jc w:val="both"/>
+      </w:pPr>
       <w:r>
         <w:t xml:space="preserve">Выдана </w:t>
       </w:r>
@@ -54,6 +57,9 @@
     </w:p>
     <w:p/>
     <w:p>
+      <w:pPr>
+        <w:jc w:val="both"/>
+      </w:pPr>
       <w:r>
         <w:t>Справка выдана для предъявления по месту требования.</w:t>
       </w:r>
@@ -73,7 +79,7 @@
     </w:p>
     <w:sectPr>
       <w:pgSz w:w="12240" w:h="15840"/>
-      <w:pgMar w:top="1440" w:right="1800" w:bottom="1440" w:left="1800" w:header="720" w:footer="720" w:gutter="0"/>
+      <w:pgMar w:top="1134" w:right="850" w:bottom="1134" w:left="1701" w:header="720" w:footer="720" w:gutter="0"/>
       <w:cols w:space="720"/>
       <w:docGrid w:linePitch="360"/>
     </w:sectPr>
@@ -444,6 +450,14 @@
     <w:name w:val="Normal"/>
     <w:qFormat/>
     <w:rsid w:val="00FC693F"/>
+    <w:pPr>
+      <w:spacing w:after="120" w:line="276" w:lineRule="auto"/>
+    </w:pPr>
+    <w:rPr>
+      <w:rFonts w:ascii="Times New Roman" w:hAnsi="Times New Roman"/>
+      <w:color w:val="000000"/>
+      <w:sz w:val="28"/>
+    </w:rPr>
   </w:style>
   <w:style w:type="paragraph" w:styleId="Header">
     <w:name w:val="header"/>
@@ -504,11 +518,11 @@
       <w:outlineLvl w:val="0"/>
     </w:pPr>
     <w:rPr>
-      <w:rFonts w:asciiTheme="majorHAnsi" w:eastAsiaTheme="majorEastAsia" w:hAnsiTheme="majorHAnsi" w:cstheme="majorBidi"/>
+      <w:rFonts w:asciiTheme="majorHAnsi" w:eastAsiaTheme="majorEastAsia" w:hAnsiTheme="majorHAnsi" w:cstheme="majorBidi" w:ascii="Times New Roman" w:hAnsi="Times New Roman"/>
       <w:b/>
       <w:bCs/>
-      <w:color w:val="365F91" w:themeColor="accent1" w:themeShade="BF"/>
-      <w:sz w:val="28"/>
+      <w:color w:val="000000"/>
+      <w:sz w:val="32"/>
       <w:szCs w:val="28"/>
     </w:rPr>
   </w:style>

</xml_diff>